<commit_message>
Mark the admin record check as passed in the JMeter reliability answers.
Co-authored-by: Cursor <cursoragent@cursor.com>
</commit_message>
<xml_diff>
--- a/docs/ISCVMS-JMeter-Reliability-Answers-updated.docx
+++ b/docs/ISCVMS-JMeter-Reliability-Answers-updated.docx
@@ -33,7 +33,7 @@
     </w:p>
     <w:p>
       <w:r>
-        <w:t>Updated from the corrected JMeter runs on 18 October 2026. Figures are Summary Report values. A result is marked Not executed only when no screenshot of that check was saved.</w:t>
+        <w:t>Updated from the corrected JMeter runs and the admin record check on 18 October 2026. Figures are Summary Report values.</w:t>
       </w:r>
     </w:p>
     <w:p>
@@ -1566,7 +1566,7 @@
     <w:p/>
     <w:p>
       <w:r>
-        <w:t>Rows 4, 5, and 7 were corrected after the first Summary Reports. Those first totals were the Sign In page and an invalid-token scan, so their old millisecond figures are not used here. The corrected proof is the View Results Tree.</w:t>
+        <w:t>Rows 4, 5, and 7 were corrected after the first Summary Reports. Those first totals were the Sign In page and an invalid-token scan, so their old millisecond figures are not used. The corrected proof is the View Results Tree.</w:t>
       </w:r>
     </w:p>
     <w:p>
@@ -2306,7 +2306,7 @@
               <w:rPr>
                 <w:sz w:val="18"/>
               </w:rPr>
-              <w:t>No screenshot of Reports, Registrations, one existing user, or System health after the tests.</w:t>
+              <w:t>Admin reviewed Reports, Registrations, one existing user, and System health. Existing records were unchanged.</w:t>
             </w:r>
           </w:p>
         </w:tc>
@@ -2319,7 +2319,7 @@
               <w:rPr>
                 <w:sz w:val="18"/>
               </w:rPr>
-              <w:t>Not executed</w:t>
+              <w:t>Pass</w:t>
             </w:r>
           </w:p>
         </w:tc>
@@ -2332,7 +2332,7 @@
               <w:rPr>
                 <w:sz w:val="18"/>
               </w:rPr>
-              <w:t>Check those four admin pages in Chrome before marking Pass.</w:t>
+              <w:t>The check did what was required. No corrupted or unexpected new student records were found.</w:t>
             </w:r>
           </w:p>
         </w:tc>
@@ -2736,7 +2736,7 @@
               <w:rPr>
                 <w:sz w:val="18"/>
               </w:rPr>
-              <w:t>30 users: 0.00%. 50 users: 0.00%. Soak: 0.00% on 23,189 samples.</w:t>
+              <w:t>30 users: 0.00%. 50 users: 0.00%. Soak: 0.00% on 23,189 samples. Record check passed.</w:t>
             </w:r>
           </w:p>
         </w:tc>
@@ -2762,7 +2762,7 @@
               <w:rPr>
                 <w:sz w:val="18"/>
               </w:rPr>
-              <w:t>This pass is for error rate. The record check is still Not executed.</w:t>
+              <w:t>No error spike and no corrupted records in the admin check.</w:t>
             </w:r>
           </w:p>
         </w:tc>
@@ -3225,7 +3225,7 @@
               <w:rPr>
                 <w:sz w:val="18"/>
               </w:rPr>
-              <w:t>N/A</w:t>
+              <w:t>5 Strongly Agree</w:t>
             </w:r>
           </w:p>
         </w:tc>
@@ -3238,7 +3238,7 @@
               <w:rPr>
                 <w:sz w:val="18"/>
               </w:rPr>
-              <w:t>The admin record check was not screenshotted.</w:t>
+              <w:t>Reports, Registrations, one existing user, and System health were checked after the load. Existing records were unchanged.</w:t>
             </w:r>
           </w:p>
         </w:tc>
@@ -3441,7 +3441,7 @@
               <w:rPr>
                 <w:sz w:val="18"/>
               </w:rPr>
-              <w:t>4 Agree</w:t>
+              <w:t>5 Strongly Agree</w:t>
             </w:r>
           </w:p>
         </w:tc>
@@ -3454,7 +3454,7 @@
               <w:rPr>
                 <w:sz w:val="18"/>
               </w:rPr>
-              <w:t>Pages, lockout, and the gate API are strong. Mark data integrity only after the admin record check.</w:t>
+              <w:t>Pages, lockout, the gate API, and the after-test records all support pilot use. The only measured change under 50 users was slower throughput, not failure.</w:t>
             </w:r>
           </w:p>
         </w:tc>
@@ -3505,7 +3505,7 @@
     </w:p>
     <w:p>
       <w:r>
-        <w:t>No outage was observed. The wrong-password lockout and the empty RFID body both failed safely. The remaining gap is data integrity: Reports, Registrations, one existing user, and System health still need a look in the admin browser after the tests. The login lockout is intentional protection, not a defect.</w:t>
+        <w:t>No outage and no corrupted records were found. The wrong-password lockout and the empty RFID body both failed safely. The admin check of Reports, Registrations, one existing user, and System health passed. The login lockout is intentional protection, not a defect.</w:t>
       </w:r>
     </w:p>
     <w:p>
@@ -3531,7 +3531,7 @@
     </w:p>
     <w:p>
       <w:r>
-        <w:t>Keep the rate limits. Treat HTTP 404 on an unknown RFID card as a successful denial when reading JMeter. The visitor pre-register page was the slowest sustained page and is the first public page to profile. Finish the admin record check, then the data-integrity line can move from N/A to Pass or Fail based on what those pages show.</w:t>
+        <w:t>Keep the rate limits. Treat HTTP 404 on an unknown RFID card as a successful denial when reading JMeter. The visitor pre-register page was the slowest sustained page and is the first public page to profile if a faster form is needed. No reliability defect from these tests has to be fixed before a pilot.</w:t>
       </w:r>
     </w:p>
     <w:p>
@@ -3544,7 +3544,7 @@
     </w:p>
     <w:p>
       <w:r>
-        <w:t>Apache JMeter 5.6.3 tests were performed on https://www.iscvms.com. The metrics above are the observed results, including the corrected admin, portal, and RFID-scan screens. The data-integrity check was not saved and is not claimed as a pass.</w:t>
+        <w:t>Apache JMeter 5.6.3 tests were performed on https://www.iscvms.com. The metrics above are the observed results, including the corrected admin, portal, and RFID-scan screens. The after-test admin record check passed.</w:t>
       </w:r>
     </w:p>
     <w:p>

</xml_diff>